<commit_message>
feat: refactorizar pruebas unitarias basadas en el contrato de operaciones de la documentacion
</commit_message>
<xml_diff>
--- a/Pruebas_Unitarias_MilkChain.docx
+++ b/Pruebas_Unitarias_MilkChain.docx
@@ -7,12 +7,12 @@
         <w:pStyle w:val="AppTitle"/>
       </w:pPr>
       <w:r>
-        <w:t>Pruebas Unitarias de Métodos de Negocio (Backend) - MilkChain</w:t>
+        <w:t>Resultados de Pruebas Unitarias (Backend) - MilkChain</w:t>
       </w:r>
     </w:p>
     <w:p>
       <w:r>
-        <w:t>Este documento presenta los escenarios de prueba unitaria para los métodos internos que componen las operaciones críticas del sistema MilkChain, aislando la lógica de negocio mediante mocks de la base de datos.</w:t>
+        <w:t>Este documento presenta los escenarios y resultados de las pruebas unitarias para los métodos puros que implementan los contratos de operaciones del sistema en el backend de MilkChain.</w:t>
       </w:r>
     </w:p>
     <w:p>
@@ -20,14 +20,14 @@
         <w:pStyle w:val="Heading2"/>
       </w:pPr>
       <w:r>
-        <w:t>1. Método: validarStockDisponibilidad</w:t>
+        <w:t>1. Contrato de Operación: finalizarPedido</w:t>
       </w:r>
     </w:p>
     <w:p>
       <w:r>
-        <w:t>Valida si hay stock suficiente en la base de datos para cada uno de los productos solicitados en el carrito antes de procesar el pedido. Si hay stock insuficiente, lanza una excepción.</w:t>
+        <w:t>Registra un nuevo pedido y actualiza el stock correspondiente en la base de datos.</w:t>
         <w:br/>
-        <w:t>Firma: public async void validarStockDisponibilidad(connection, detalles)</w:t>
+        <w:t>Firma del método: public async object finalizarPedidoMetodo(id_usuario, id_metodo_pago, Total, detalles)</w:t>
       </w:r>
     </w:p>
     <w:tbl>
@@ -45,52 +45,84 @@
         </w:tblBorders>
       </w:tblPr>
       <w:tblGrid>
-        <w:gridCol w:w="2160"/>
-        <w:gridCol w:w="2160"/>
-        <w:gridCol w:w="3600"/>
-        <w:gridCol w:w="2160"/>
+        <w:gridCol w:w="1560"/>
+        <w:gridCol w:w="1560"/>
+        <w:gridCol w:w="1560"/>
+        <w:gridCol w:w="1560"/>
+        <w:gridCol w:w="1560"/>
+        <w:gridCol w:w="1560"/>
       </w:tblGrid>
       <w:tr>
         <w:tc>
           <w:tcPr>
-            <w:tcW w:type="dxa" w:w="2340"/>
+            <w:tcW w:type="dxa" w:w="1560"/>
             <w:shd w:val="clear" w:color="auto" w:fill="EAEAEA"/>
           </w:tcPr>
           <w:p>
             <w:r>
               <w:rPr>
                 <w:b/>
-                <w:sz w:val="20"/>
+                <w:sz w:val="19"/>
               </w:rPr>
-              <w:t>detalles (Cant. Pedida)</w:t>
+              <w:t>id_usuario</w:t>
             </w:r>
           </w:p>
         </w:tc>
         <w:tc>
           <w:tcPr>
-            <w:tcW w:type="dxa" w:w="2340"/>
+            <w:tcW w:type="dxa" w:w="1560"/>
             <w:shd w:val="clear" w:color="auto" w:fill="EAEAEA"/>
           </w:tcPr>
           <w:p>
             <w:r>
               <w:rPr>
                 <w:b/>
-                <w:sz w:val="20"/>
+                <w:sz w:val="19"/>
               </w:rPr>
-              <w:t>Stock en BD</w:t>
+              <w:t>id_metodo_pago</w:t>
             </w:r>
           </w:p>
         </w:tc>
         <w:tc>
           <w:tcPr>
-            <w:tcW w:type="dxa" w:w="2340"/>
+            <w:tcW w:type="dxa" w:w="1560"/>
             <w:shd w:val="clear" w:color="auto" w:fill="EAEAEA"/>
           </w:tcPr>
           <w:p>
             <w:r>
               <w:rPr>
                 <w:b/>
-                <w:sz w:val="20"/>
+                <w:sz w:val="19"/>
+              </w:rPr>
+              <w:t>Total</w:t>
+            </w:r>
+          </w:p>
+        </w:tc>
+        <w:tc>
+          <w:tcPr>
+            <w:tcW w:type="dxa" w:w="1560"/>
+            <w:shd w:val="clear" w:color="auto" w:fill="EAEAEA"/>
+          </w:tcPr>
+          <w:p>
+            <w:r>
+              <w:rPr>
+                <w:b/>
+                <w:sz w:val="19"/>
+              </w:rPr>
+              <w:t>detalles (Carrito)</w:t>
+            </w:r>
+          </w:p>
+        </w:tc>
+        <w:tc>
+          <w:tcPr>
+            <w:tcW w:type="dxa" w:w="1560"/>
+            <w:shd w:val="clear" w:color="auto" w:fill="EAEAEA"/>
+          </w:tcPr>
+          <w:p>
+            <w:r>
+              <w:rPr>
+                <w:b/>
+                <w:sz w:val="19"/>
               </w:rPr>
               <w:t>Descripción</w:t>
             </w:r>
@@ -98,14 +130,14 @@
         </w:tc>
         <w:tc>
           <w:tcPr>
-            <w:tcW w:type="dxa" w:w="2340"/>
+            <w:tcW w:type="dxa" w:w="1560"/>
             <w:shd w:val="clear" w:color="auto" w:fill="EAEAEA"/>
           </w:tcPr>
           <w:p>
             <w:r>
               <w:rPr>
                 <w:b/>
-                <w:sz w:val="20"/>
+                <w:sz w:val="19"/>
               </w:rPr>
               <w:t>Resultado esperado</w:t>
             </w:r>
@@ -115,53 +147,81 @@
       <w:tr>
         <w:tc>
           <w:tcPr>
-            <w:tcW w:type="dxa" w:w="2340"/>
+            <w:tcW w:type="dxa" w:w="1560"/>
           </w:tcPr>
           <w:p>
             <w:r>
               <w:rPr>
-                <w:sz w:val="20"/>
+                <w:sz w:val="19"/>
               </w:rPr>
-              <w:t>[{ Cantidad: 3 }]</w:t>
+              <w:t>1</w:t>
             </w:r>
           </w:p>
         </w:tc>
         <w:tc>
           <w:tcPr>
-            <w:tcW w:type="dxa" w:w="2340"/>
+            <w:tcW w:type="dxa" w:w="1560"/>
           </w:tcPr>
           <w:p>
             <w:r>
               <w:rPr>
-                <w:sz w:val="20"/>
+                <w:sz w:val="19"/>
               </w:rPr>
-              <w:t>10</w:t>
+              <w:t>1</w:t>
             </w:r>
           </w:p>
         </w:tc>
         <w:tc>
           <w:tcPr>
-            <w:tcW w:type="dxa" w:w="2340"/>
+            <w:tcW w:type="dxa" w:w="1560"/>
           </w:tcPr>
           <w:p>
             <w:r>
               <w:rPr>
-                <w:sz w:val="20"/>
+                <w:sz w:val="19"/>
               </w:rPr>
-              <w:t>Validación exitosa cuando hay stock suficiente</w:t>
+              <w:t>5000</w:t>
             </w:r>
           </w:p>
         </w:tc>
         <w:tc>
           <w:tcPr>
-            <w:tcW w:type="dxa" w:w="2340"/>
+            <w:tcW w:type="dxa" w:w="1560"/>
           </w:tcPr>
           <w:p>
             <w:r>
               <w:rPr>
-                <w:sz w:val="20"/>
+                <w:sz w:val="19"/>
               </w:rPr>
-              <w:t>Ejecución correcta (no arroja error)</w:t>
+              <w:t>[{ id_producto: 5, Cantidad: 10, Precio: 500 }]</w:t>
+              <w:br/>
+              <w:t>(Stock en BD: 3)</w:t>
+            </w:r>
+          </w:p>
+        </w:tc>
+        <w:tc>
+          <w:tcPr>
+            <w:tcW w:type="dxa" w:w="1560"/>
+          </w:tcPr>
+          <w:p>
+            <w:r>
+              <w:rPr>
+                <w:sz w:val="19"/>
+              </w:rPr>
+              <w:t>La cantidad solicitada supera el stock disponible en la base de datos.</w:t>
+            </w:r>
+          </w:p>
+        </w:tc>
+        <w:tc>
+          <w:tcPr>
+            <w:tcW w:type="dxa" w:w="1560"/>
+          </w:tcPr>
+          <w:p>
+            <w:r>
+              <w:rPr>
+                <w:sz w:val="19"/>
+              </w:rPr>
+              <w:t>Error (Excepción: "Stock insuficiente...")</w:t>
             </w:r>
           </w:p>
         </w:tc>
@@ -169,53 +229,79 @@
       <w:tr>
         <w:tc>
           <w:tcPr>
-            <w:tcW w:type="dxa" w:w="2340"/>
+            <w:tcW w:type="dxa" w:w="1560"/>
           </w:tcPr>
           <w:p>
             <w:r>
               <w:rPr>
-                <w:sz w:val="20"/>
+                <w:sz w:val="19"/>
               </w:rPr>
-              <w:t>[{ Cantidad: 10 }]</w:t>
+              <w:t>null</w:t>
             </w:r>
           </w:p>
         </w:tc>
         <w:tc>
           <w:tcPr>
-            <w:tcW w:type="dxa" w:w="2340"/>
+            <w:tcW w:type="dxa" w:w="1560"/>
           </w:tcPr>
           <w:p>
             <w:r>
               <w:rPr>
-                <w:sz w:val="20"/>
+                <w:sz w:val="19"/>
               </w:rPr>
-              <w:t>3</w:t>
+              <w:t>1</w:t>
             </w:r>
           </w:p>
         </w:tc>
         <w:tc>
           <w:tcPr>
-            <w:tcW w:type="dxa" w:w="2340"/>
+            <w:tcW w:type="dxa" w:w="1560"/>
           </w:tcPr>
           <w:p>
             <w:r>
               <w:rPr>
-                <w:sz w:val="20"/>
+                <w:sz w:val="19"/>
               </w:rPr>
-              <w:t>Cantidad solicitada supera el stock disponible</w:t>
+              <w:t>1000</w:t>
             </w:r>
           </w:p>
         </w:tc>
         <w:tc>
           <w:tcPr>
-            <w:tcW w:type="dxa" w:w="2340"/>
+            <w:tcW w:type="dxa" w:w="1560"/>
           </w:tcPr>
           <w:p>
             <w:r>
               <w:rPr>
-                <w:sz w:val="20"/>
+                <w:sz w:val="19"/>
               </w:rPr>
-              <w:t>Excepción ("Stock insuficiente para el producto...")</w:t>
+              <w:t>[{ id_producto: 1, Cantidad: 1, Precio: 1000 }]</w:t>
+            </w:r>
+          </w:p>
+        </w:tc>
+        <w:tc>
+          <w:tcPr>
+            <w:tcW w:type="dxa" w:w="1560"/>
+          </w:tcPr>
+          <w:p>
+            <w:r>
+              <w:rPr>
+                <w:sz w:val="19"/>
+              </w:rPr>
+              <w:t>Se omite el campo id_usuario en la petición.</w:t>
+            </w:r>
+          </w:p>
+        </w:tc>
+        <w:tc>
+          <w:tcPr>
+            <w:tcW w:type="dxa" w:w="1560"/>
+          </w:tcPr>
+          <w:p>
+            <w:r>
+              <w:rPr>
+                <w:sz w:val="19"/>
+              </w:rPr>
+              <w:t>Error (Excepción: "Faltan datos...")</w:t>
             </w:r>
           </w:p>
         </w:tc>
@@ -223,53 +309,79 @@
       <w:tr>
         <w:tc>
           <w:tcPr>
-            <w:tcW w:type="dxa" w:w="2340"/>
+            <w:tcW w:type="dxa" w:w="1560"/>
           </w:tcPr>
           <w:p>
             <w:r>
               <w:rPr>
-                <w:sz w:val="20"/>
+                <w:sz w:val="19"/>
               </w:rPr>
-              <w:t>[{ Cantidad: -2 }]</w:t>
+              <w:t>1</w:t>
             </w:r>
           </w:p>
         </w:tc>
         <w:tc>
           <w:tcPr>
-            <w:tcW w:type="dxa" w:w="2340"/>
+            <w:tcW w:type="dxa" w:w="1560"/>
           </w:tcPr>
           <w:p>
             <w:r>
               <w:rPr>
-                <w:sz w:val="20"/>
+                <w:sz w:val="19"/>
               </w:rPr>
-              <w:t>10</w:t>
+              <w:t>1</w:t>
             </w:r>
           </w:p>
         </w:tc>
         <w:tc>
           <w:tcPr>
-            <w:tcW w:type="dxa" w:w="2340"/>
+            <w:tcW w:type="dxa" w:w="1560"/>
           </w:tcPr>
           <w:p>
             <w:r>
               <w:rPr>
-                <w:sz w:val="20"/>
+                <w:sz w:val="19"/>
               </w:rPr>
-              <w:t>Cantidad de compra negativa inválida</w:t>
+              <w:t>0</w:t>
             </w:r>
           </w:p>
         </w:tc>
         <w:tc>
           <w:tcPr>
-            <w:tcW w:type="dxa" w:w="2340"/>
+            <w:tcW w:type="dxa" w:w="1560"/>
           </w:tcPr>
           <w:p>
             <w:r>
               <w:rPr>
-                <w:sz w:val="20"/>
+                <w:sz w:val="19"/>
               </w:rPr>
-              <w:t>Error / Excepción</w:t>
+              <w:t>[] (Carrito vacío)</w:t>
+            </w:r>
+          </w:p>
+        </w:tc>
+        <w:tc>
+          <w:tcPr>
+            <w:tcW w:type="dxa" w:w="1560"/>
+          </w:tcPr>
+          <w:p>
+            <w:r>
+              <w:rPr>
+                <w:sz w:val="19"/>
+              </w:rPr>
+              <w:t>Se envía un carrito sin elementos.</w:t>
+            </w:r>
+          </w:p>
+        </w:tc>
+        <w:tc>
+          <w:tcPr>
+            <w:tcW w:type="dxa" w:w="1560"/>
+          </w:tcPr>
+          <w:p>
+            <w:r>
+              <w:rPr>
+                <w:sz w:val="19"/>
+              </w:rPr>
+              <w:t>Error (Excepción: "Faltan datos...")</w:t>
             </w:r>
           </w:p>
         </w:tc>
@@ -285,14 +397,14 @@
         <w:pStyle w:val="Heading2"/>
       </w:pPr>
       <w:r>
-        <w:t>2. Método: crearPedido</w:t>
+        <w:t>2. Contrato de Operación: guardarDireccion</w:t>
       </w:r>
     </w:p>
     <w:p>
       <w:r>
-        <w:t>Realiza la inserción del registro principal del pedido en la base de datos y retorna el ID generado (insertId).</w:t>
+        <w:t>Guarda una nueva dirección física para el usuario en la base de datos.</w:t>
         <w:br/>
-        <w:t>Firma: public async int crearPedido(connection, Total, id_usuario, id_metodo_pago)</w:t>
+        <w:t>Firma del método: public async object guardarDireccionMetodo(calle, numero, telefono, id_localidad, id_usuario)</w:t>
       </w:r>
     </w:p>
     <w:tbl>
@@ -310,38 +422,85 @@
         </w:tblBorders>
       </w:tblPr>
       <w:tblGrid>
-        <w:gridCol w:w="1440"/>
-        <w:gridCol w:w="1440"/>
-        <w:gridCol w:w="1728"/>
-        <w:gridCol w:w="3312"/>
-        <w:gridCol w:w="2160"/>
+        <w:gridCol w:w="1337"/>
+        <w:gridCol w:w="1337"/>
+        <w:gridCol w:w="1337"/>
+        <w:gridCol w:w="1337"/>
+        <w:gridCol w:w="1337"/>
+        <w:gridCol w:w="1337"/>
+        <w:gridCol w:w="1337"/>
       </w:tblGrid>
       <w:tr>
         <w:tc>
           <w:tcPr>
-            <w:tcW w:type="dxa" w:w="1872"/>
+            <w:tcW w:type="dxa" w:w="1337"/>
             <w:shd w:val="clear" w:color="auto" w:fill="EAEAEA"/>
           </w:tcPr>
           <w:p>
             <w:r>
               <w:rPr>
                 <w:b/>
-                <w:sz w:val="20"/>
+                <w:sz w:val="19"/>
               </w:rPr>
-              <w:t>Total</w:t>
+              <w:t>calle</w:t>
             </w:r>
           </w:p>
         </w:tc>
         <w:tc>
           <w:tcPr>
-            <w:tcW w:type="dxa" w:w="1872"/>
+            <w:tcW w:type="dxa" w:w="1337"/>
             <w:shd w:val="clear" w:color="auto" w:fill="EAEAEA"/>
           </w:tcPr>
           <w:p>
             <w:r>
               <w:rPr>
                 <w:b/>
-                <w:sz w:val="20"/>
+                <w:sz w:val="19"/>
+              </w:rPr>
+              <w:t>numero</w:t>
+            </w:r>
+          </w:p>
+        </w:tc>
+        <w:tc>
+          <w:tcPr>
+            <w:tcW w:type="dxa" w:w="1337"/>
+            <w:shd w:val="clear" w:color="auto" w:fill="EAEAEA"/>
+          </w:tcPr>
+          <w:p>
+            <w:r>
+              <w:rPr>
+                <w:b/>
+                <w:sz w:val="19"/>
+              </w:rPr>
+              <w:t>telefono</w:t>
+            </w:r>
+          </w:p>
+        </w:tc>
+        <w:tc>
+          <w:tcPr>
+            <w:tcW w:type="dxa" w:w="1337"/>
+            <w:shd w:val="clear" w:color="auto" w:fill="EAEAEA"/>
+          </w:tcPr>
+          <w:p>
+            <w:r>
+              <w:rPr>
+                <w:b/>
+                <w:sz w:val="19"/>
+              </w:rPr>
+              <w:t>id_localidad</w:t>
+            </w:r>
+          </w:p>
+        </w:tc>
+        <w:tc>
+          <w:tcPr>
+            <w:tcW w:type="dxa" w:w="1337"/>
+            <w:shd w:val="clear" w:color="auto" w:fill="EAEAEA"/>
+          </w:tcPr>
+          <w:p>
+            <w:r>
+              <w:rPr>
+                <w:b/>
+                <w:sz w:val="19"/>
               </w:rPr>
               <w:t>id_usuario</w:t>
             </w:r>
@@ -349,29 +508,14 @@
         </w:tc>
         <w:tc>
           <w:tcPr>
-            <w:tcW w:type="dxa" w:w="1872"/>
+            <w:tcW w:type="dxa" w:w="1337"/>
             <w:shd w:val="clear" w:color="auto" w:fill="EAEAEA"/>
           </w:tcPr>
           <w:p>
             <w:r>
               <w:rPr>
                 <w:b/>
-                <w:sz w:val="20"/>
-              </w:rPr>
-              <w:t>id_metodo_pago</w:t>
-            </w:r>
-          </w:p>
-        </w:tc>
-        <w:tc>
-          <w:tcPr>
-            <w:tcW w:type="dxa" w:w="1872"/>
-            <w:shd w:val="clear" w:color="auto" w:fill="EAEAEA"/>
-          </w:tcPr>
-          <w:p>
-            <w:r>
-              <w:rPr>
-                <w:b/>
-                <w:sz w:val="20"/>
+                <w:sz w:val="19"/>
               </w:rPr>
               <w:t>Descripción</w:t>
             </w:r>
@@ -379,14 +523,14 @@
         </w:tc>
         <w:tc>
           <w:tcPr>
-            <w:tcW w:type="dxa" w:w="1872"/>
+            <w:tcW w:type="dxa" w:w="1337"/>
             <w:shd w:val="clear" w:color="auto" w:fill="EAEAEA"/>
           </w:tcPr>
           <w:p>
             <w:r>
               <w:rPr>
                 <w:b/>
-                <w:sz w:val="20"/>
+                <w:sz w:val="19"/>
               </w:rPr>
               <w:t>Resultado esperado</w:t>
             </w:r>
@@ -396,66 +540,92 @@
       <w:tr>
         <w:tc>
           <w:tcPr>
-            <w:tcW w:type="dxa" w:w="1872"/>
+            <w:tcW w:type="dxa" w:w="1337"/>
           </w:tcPr>
           <w:p>
             <w:r>
               <w:rPr>
-                <w:sz w:val="20"/>
+                <w:sz w:val="19"/>
               </w:rPr>
-              <w:t>3000</w:t>
+              <w:t>"Av. Siempre Viva"</w:t>
             </w:r>
           </w:p>
         </w:tc>
         <w:tc>
           <w:tcPr>
-            <w:tcW w:type="dxa" w:w="1872"/>
+            <w:tcW w:type="dxa" w:w="1337"/>
           </w:tcPr>
           <w:p>
             <w:r>
               <w:rPr>
-                <w:sz w:val="20"/>
+                <w:sz w:val="19"/>
               </w:rPr>
-              <w:t>5</w:t>
+              <w:t>742</w:t>
             </w:r>
           </w:p>
         </w:tc>
         <w:tc>
           <w:tcPr>
-            <w:tcW w:type="dxa" w:w="1872"/>
+            <w:tcW w:type="dxa" w:w="1337"/>
           </w:tcPr>
           <w:p>
             <w:r>
               <w:rPr>
-                <w:sz w:val="20"/>
+                <w:sz w:val="19"/>
               </w:rPr>
-              <w:t>2</w:t>
+              <w:t>"12345678"</w:t>
             </w:r>
           </w:p>
         </w:tc>
         <w:tc>
           <w:tcPr>
-            <w:tcW w:type="dxa" w:w="1872"/>
+            <w:tcW w:type="dxa" w:w="1337"/>
           </w:tcPr>
           <w:p>
             <w:r>
               <w:rPr>
-                <w:sz w:val="20"/>
+                <w:sz w:val="19"/>
               </w:rPr>
-              <w:t>Inserción exitosa de pedido con datos válidos</w:t>
+              <w:t>3</w:t>
             </w:r>
           </w:p>
         </w:tc>
         <w:tc>
           <w:tcPr>
-            <w:tcW w:type="dxa" w:w="1872"/>
+            <w:tcW w:type="dxa" w:w="1337"/>
           </w:tcPr>
           <w:p>
             <w:r>
               <w:rPr>
-                <w:sz w:val="20"/>
+                <w:sz w:val="19"/>
               </w:rPr>
-              <w:t>Retorna insertId (ej: 77)</w:t>
+              <w:t>10</w:t>
+            </w:r>
+          </w:p>
+        </w:tc>
+        <w:tc>
+          <w:tcPr>
+            <w:tcW w:type="dxa" w:w="1337"/>
+          </w:tcPr>
+          <w:p>
+            <w:r>
+              <w:rPr>
+                <w:sz w:val="19"/>
+              </w:rPr>
+              <w:t>Registro de dirección con todos los datos válidos.</w:t>
+            </w:r>
+          </w:p>
+        </w:tc>
+        <w:tc>
+          <w:tcPr>
+            <w:tcW w:type="dxa" w:w="1337"/>
+          </w:tcPr>
+          <w:p>
+            <w:r>
+              <w:rPr>
+                <w:sz w:val="19"/>
+              </w:rPr>
+              <w:t>Retorna { id: 42 } (Éxito)</w:t>
             </w:r>
           </w:p>
         </w:tc>
@@ -463,25 +633,12 @@
       <w:tr>
         <w:tc>
           <w:tcPr>
-            <w:tcW w:type="dxa" w:w="1872"/>
+            <w:tcW w:type="dxa" w:w="1337"/>
           </w:tcPr>
           <w:p>
             <w:r>
               <w:rPr>
-                <w:sz w:val="20"/>
-              </w:rPr>
-              <w:t>3000</w:t>
-            </w:r>
-          </w:p>
-        </w:tc>
-        <w:tc>
-          <w:tcPr>
-            <w:tcW w:type="dxa" w:w="1872"/>
-          </w:tcPr>
-          <w:p>
-            <w:r>
-              <w:rPr>
-                <w:sz w:val="20"/>
+                <w:sz w:val="19"/>
               </w:rPr>
               <w:t>null</w:t>
             </w:r>
@@ -489,79 +646,25 @@
         </w:tc>
         <w:tc>
           <w:tcPr>
-            <w:tcW w:type="dxa" w:w="1872"/>
+            <w:tcW w:type="dxa" w:w="1337"/>
           </w:tcPr>
           <w:p>
             <w:r>
               <w:rPr>
-                <w:sz w:val="20"/>
+                <w:sz w:val="19"/>
               </w:rPr>
-              <w:t>2</w:t>
+              <w:t>742</w:t>
             </w:r>
           </w:p>
         </w:tc>
         <w:tc>
           <w:tcPr>
-            <w:tcW w:type="dxa" w:w="1872"/>
+            <w:tcW w:type="dxa" w:w="1337"/>
           </w:tcPr>
           <w:p>
             <w:r>
               <w:rPr>
-                <w:sz w:val="20"/>
-              </w:rPr>
-              <w:t>Intento de creación sin id_usuario</w:t>
-            </w:r>
-          </w:p>
-        </w:tc>
-        <w:tc>
-          <w:tcPr>
-            <w:tcW w:type="dxa" w:w="1872"/>
-          </w:tcPr>
-          <w:p>
-            <w:r>
-              <w:rPr>
-                <w:sz w:val="20"/>
-              </w:rPr>
-              <w:t>Error (Falla de base de datos)</w:t>
-            </w:r>
-          </w:p>
-        </w:tc>
-      </w:tr>
-      <w:tr>
-        <w:tc>
-          <w:tcPr>
-            <w:tcW w:type="dxa" w:w="1872"/>
-          </w:tcPr>
-          <w:p>
-            <w:r>
-              <w:rPr>
-                <w:sz w:val="20"/>
-              </w:rPr>
-              <w:t>3000</w:t>
-            </w:r>
-          </w:p>
-        </w:tc>
-        <w:tc>
-          <w:tcPr>
-            <w:tcW w:type="dxa" w:w="1872"/>
-          </w:tcPr>
-          <w:p>
-            <w:r>
-              <w:rPr>
-                <w:sz w:val="20"/>
-              </w:rPr>
-              <w:t>5</w:t>
-            </w:r>
-          </w:p>
-        </w:tc>
-        <w:tc>
-          <w:tcPr>
-            <w:tcW w:type="dxa" w:w="1872"/>
-          </w:tcPr>
-          <w:p>
-            <w:r>
-              <w:rPr>
-                <w:sz w:val="20"/>
+                <w:sz w:val="19"/>
               </w:rPr>
               <w:t>null</w:t>
             </w:r>
@@ -569,27 +672,53 @@
         </w:tc>
         <w:tc>
           <w:tcPr>
-            <w:tcW w:type="dxa" w:w="1872"/>
+            <w:tcW w:type="dxa" w:w="1337"/>
           </w:tcPr>
           <w:p>
             <w:r>
               <w:rPr>
-                <w:sz w:val="20"/>
+                <w:sz w:val="19"/>
               </w:rPr>
-              <w:t>Intento de creación sin id_metodo_pago</w:t>
+              <w:t>3</w:t>
             </w:r>
           </w:p>
         </w:tc>
         <w:tc>
           <w:tcPr>
-            <w:tcW w:type="dxa" w:w="1872"/>
+            <w:tcW w:type="dxa" w:w="1337"/>
           </w:tcPr>
           <w:p>
             <w:r>
               <w:rPr>
-                <w:sz w:val="20"/>
+                <w:sz w:val="19"/>
               </w:rPr>
-              <w:t>Error (Falla de base de datos)</w:t>
+              <w:t>null</w:t>
+            </w:r>
+          </w:p>
+        </w:tc>
+        <w:tc>
+          <w:tcPr>
+            <w:tcW w:type="dxa" w:w="1337"/>
+          </w:tcPr>
+          <w:p>
+            <w:r>
+              <w:rPr>
+                <w:sz w:val="19"/>
+              </w:rPr>
+              <w:t>Envío omitiendo campos obligatorios (calle, teléfono, id_usuario).</w:t>
+            </w:r>
+          </w:p>
+        </w:tc>
+        <w:tc>
+          <w:tcPr>
+            <w:tcW w:type="dxa" w:w="1337"/>
+          </w:tcPr>
+          <w:p>
+            <w:r>
+              <w:rPr>
+                <w:sz w:val="19"/>
+              </w:rPr>
+              <w:t>Error (Excepción: "Campos no válidos")</w:t>
             </w:r>
           </w:p>
         </w:tc>
@@ -605,14 +734,14 @@
         <w:pStyle w:val="Heading2"/>
       </w:pPr>
       <w:r>
-        <w:t>3. Método: registrarDetalles</w:t>
+        <w:t>3. Contrato de Operación: actualizarEstado</w:t>
       </w:r>
     </w:p>
     <w:p>
       <w:r>
-        <w:t>Inserta de forma masiva (bulk insert) los detalles asociados a un pedido (productos, cantidades y precios unitarios).</w:t>
+        <w:t>Actualiza el estado logístico de un pedido existente.</w:t>
         <w:br/>
-        <w:t>Firma: public async void registrarDetalles(connection, pedidoId, detalles)</w:t>
+        <w:t>Firma del método: public async object actualizarEstadoMetodo(id, nuevoEstadoId)</w:t>
       </w:r>
     </w:p>
     <w:tbl>
@@ -630,10 +759,10 @@
         </w:tblBorders>
       </w:tblPr>
       <w:tblGrid>
-        <w:gridCol w:w="1728"/>
-        <w:gridCol w:w="2592"/>
-        <w:gridCol w:w="3600"/>
-        <w:gridCol w:w="2160"/>
+        <w:gridCol w:w="2340"/>
+        <w:gridCol w:w="2340"/>
+        <w:gridCol w:w="2340"/>
+        <w:gridCol w:w="2340"/>
       </w:tblGrid>
       <w:tr>
         <w:tc>
@@ -645,9 +774,9 @@
             <w:r>
               <w:rPr>
                 <w:b/>
-                <w:sz w:val="20"/>
+                <w:sz w:val="19"/>
               </w:rPr>
-              <w:t>pedidoId</w:t>
+              <w:t>id (ID Pedido)</w:t>
             </w:r>
           </w:p>
         </w:tc>
@@ -660,9 +789,9 @@
             <w:r>
               <w:rPr>
                 <w:b/>
-                <w:sz w:val="20"/>
+                <w:sz w:val="19"/>
               </w:rPr>
-              <w:t>detalles (Cant., Precio)</w:t>
+              <w:t>nuevoEstadoId</w:t>
             </w:r>
           </w:p>
         </w:tc>
@@ -675,7 +804,7 @@
             <w:r>
               <w:rPr>
                 <w:b/>
-                <w:sz w:val="20"/>
+                <w:sz w:val="19"/>
               </w:rPr>
               <w:t>Descripción</w:t>
             </w:r>
@@ -690,7 +819,7 @@
             <w:r>
               <w:rPr>
                 <w:b/>
-                <w:sz w:val="20"/>
+                <w:sz w:val="19"/>
               </w:rPr>
               <w:t>Resultado esperado</w:t>
             </w:r>
@@ -705,9 +834,9 @@
           <w:p>
             <w:r>
               <w:rPr>
-                <w:sz w:val="20"/>
+                <w:sz w:val="19"/>
               </w:rPr>
-              <w:t>77</w:t>
+              <w:t>20</w:t>
             </w:r>
           </w:p>
         </w:tc>
@@ -718,9 +847,9 @@
           <w:p>
             <w:r>
               <w:rPr>
-                <w:sz w:val="20"/>
+                <w:sz w:val="19"/>
               </w:rPr>
-              <w:t>[{ Cantidad: 4, Precio: 150 }]</w:t>
+              <w:t>2</w:t>
             </w:r>
           </w:p>
         </w:tc>
@@ -731,9 +860,9 @@
           <w:p>
             <w:r>
               <w:rPr>
-                <w:sz w:val="20"/>
+                <w:sz w:val="19"/>
               </w:rPr>
-              <w:t>Registro válido de detalles de pedido</w:t>
+              <w:t>Cambio de estado de un pedido registrado en la BD.</w:t>
             </w:r>
           </w:p>
         </w:tc>
@@ -744,9 +873,9 @@
           <w:p>
             <w:r>
               <w:rPr>
-                <w:sz w:val="20"/>
+                <w:sz w:val="19"/>
               </w:rPr>
-              <w:t>Ejecución exitosa</w:t>
+              <w:t>Retorna: { message: 'Estado actualizado...', id_estado: 2 }</w:t>
             </w:r>
           </w:p>
         </w:tc>
@@ -759,9 +888,9 @@
           <w:p>
             <w:r>
               <w:rPr>
-                <w:sz w:val="20"/>
+                <w:sz w:val="19"/>
               </w:rPr>
-              <w:t>null</w:t>
+              <w:t>20</w:t>
             </w:r>
           </w:p>
         </w:tc>
@@ -772,9 +901,9 @@
           <w:p>
             <w:r>
               <w:rPr>
-                <w:sz w:val="20"/>
+                <w:sz w:val="19"/>
               </w:rPr>
-              <w:t>[{ Cantidad: 4, Precio: 150 }]</w:t>
+              <w:t>""</w:t>
             </w:r>
           </w:p>
         </w:tc>
@@ -785,9 +914,9 @@
           <w:p>
             <w:r>
               <w:rPr>
-                <w:sz w:val="20"/>
+                <w:sz w:val="19"/>
               </w:rPr>
-              <w:t>Intento de registro sin pedido asociado</w:t>
+              <w:t>Intento de cambio de estado sin haber seleccionado ningún estado.</w:t>
             </w:r>
           </w:p>
         </w:tc>
@@ -798,9 +927,9 @@
           <w:p>
             <w:r>
               <w:rPr>
-                <w:sz w:val="20"/>
+                <w:sz w:val="19"/>
               </w:rPr>
-              <w:t>Error</w:t>
+              <w:t>Error (Excepción: "Campos no válidos")</w:t>
             </w:r>
           </w:p>
         </w:tc>
@@ -813,9 +942,9 @@
           <w:p>
             <w:r>
               <w:rPr>
-                <w:sz w:val="20"/>
+                <w:sz w:val="19"/>
               </w:rPr>
-              <w:t>77</w:t>
+              <w:t>999</w:t>
             </w:r>
           </w:p>
         </w:tc>
@@ -826,9 +955,9 @@
           <w:p>
             <w:r>
               <w:rPr>
-                <w:sz w:val="20"/>
+                <w:sz w:val="19"/>
               </w:rPr>
-              <w:t>[]</w:t>
+              <w:t>2</w:t>
             </w:r>
           </w:p>
         </w:tc>
@@ -839,9 +968,9 @@
           <w:p>
             <w:r>
               <w:rPr>
-                <w:sz w:val="20"/>
+                <w:sz w:val="19"/>
               </w:rPr>
-              <w:t>Intento de registro con lista de detalles vacía</w:t>
+              <w:t>Intento de cambio de estado para un pedido que no existe en la BD.</w:t>
             </w:r>
           </w:p>
         </w:tc>
@@ -852,112 +981,9 @@
           <w:p>
             <w:r>
               <w:rPr>
-                <w:sz w:val="20"/>
+                <w:sz w:val="19"/>
               </w:rPr>
-              <w:t>Error</w:t>
-            </w:r>
-          </w:p>
-        </w:tc>
-      </w:tr>
-    </w:tbl>
-    <w:p>
-      <w:pPr>
-        <w:spacing w:after="240"/>
-      </w:pPr>
-    </w:p>
-    <w:p>
-      <w:pPr>
-        <w:pStyle w:val="Heading2"/>
-      </w:pPr>
-      <w:r>
-        <w:t>4. Método: descontarStock</w:t>
-      </w:r>
-    </w:p>
-    <w:p>
-      <w:r>
-        <w:t>Reduce el stock disponible de los productos correspondientes en la base de datos tras confirmarse el pedido.</w:t>
-        <w:br/>
-        <w:t>Firma: public async void descontarStock(connection, detalles)</w:t>
-      </w:r>
-    </w:p>
-    <w:tbl>
-      <w:tblPr>
-        <w:tblW w:type="auto" w:w="0"/>
-        <w:jc w:val="center"/>
-        <w:tblLook w:firstColumn="1" w:firstRow="1" w:lastColumn="0" w:lastRow="0" w:noHBand="0" w:noVBand="1" w:val="04A0"/>
-        <w:tblBorders>
-          <w:top w:val="single" w:sz="4" w:space="0" w:color="D0D0D0"/>
-          <w:left w:val="single" w:sz="4" w:space="0" w:color="D0D0D0"/>
-          <w:bottom w:val="single" w:sz="4" w:space="0" w:color="D0D0D0"/>
-          <w:right w:val="single" w:sz="4" w:space="0" w:color="D0D0D0"/>
-          <w:insideH w:val="single" w:sz="4" w:space="0" w:color="D0D0D0"/>
-          <w:insideV w:val="single" w:sz="4" w:space="0" w:color="D0D0D0"/>
-        </w:tblBorders>
-      </w:tblPr>
-      <w:tblGrid>
-        <w:gridCol w:w="1728"/>
-        <w:gridCol w:w="1728"/>
-        <w:gridCol w:w="4464"/>
-        <w:gridCol w:w="2160"/>
-      </w:tblGrid>
-      <w:tr>
-        <w:tc>
-          <w:tcPr>
-            <w:tcW w:type="dxa" w:w="2340"/>
-            <w:shd w:val="clear" w:color="auto" w:fill="EAEAEA"/>
-          </w:tcPr>
-          <w:p>
-            <w:r>
-              <w:rPr>
-                <w:b/>
-                <w:sz w:val="20"/>
-              </w:rPr>
-              <w:t>id_producto</w:t>
-            </w:r>
-          </w:p>
-        </w:tc>
-        <w:tc>
-          <w:tcPr>
-            <w:tcW w:type="dxa" w:w="2340"/>
-            <w:shd w:val="clear" w:color="auto" w:fill="EAEAEA"/>
-          </w:tcPr>
-          <w:p>
-            <w:r>
-              <w:rPr>
-                <w:b/>
-                <w:sz w:val="20"/>
-              </w:rPr>
-              <w:t>Cantidad</w:t>
-            </w:r>
-          </w:p>
-        </w:tc>
-        <w:tc>
-          <w:tcPr>
-            <w:tcW w:type="dxa" w:w="2340"/>
-            <w:shd w:val="clear" w:color="auto" w:fill="EAEAEA"/>
-          </w:tcPr>
-          <w:p>
-            <w:r>
-              <w:rPr>
-                <w:b/>
-                <w:sz w:val="20"/>
-              </w:rPr>
-              <w:t>Descripción</w:t>
-            </w:r>
-          </w:p>
-        </w:tc>
-        <w:tc>
-          <w:tcPr>
-            <w:tcW w:type="dxa" w:w="2340"/>
-            <w:shd w:val="clear" w:color="auto" w:fill="EAEAEA"/>
-          </w:tcPr>
-          <w:p>
-            <w:r>
-              <w:rPr>
-                <w:b/>
-                <w:sz w:val="20"/>
-              </w:rPr>
-              <w:t>Resultado esperado</w:t>
+              <w:t>Error (Excepción: "Pedido no encontrado")</w:t>
             </w:r>
           </w:p>
         </w:tc>
@@ -970,9 +996,9 @@
           <w:p>
             <w:r>
               <w:rPr>
-                <w:sz w:val="20"/>
+                <w:sz w:val="19"/>
               </w:rPr>
-              <w:t>3</w:t>
+              <w:t>20</w:t>
             </w:r>
           </w:p>
         </w:tc>
@@ -983,9 +1009,9 @@
           <w:p>
             <w:r>
               <w:rPr>
-                <w:sz w:val="20"/>
+                <w:sz w:val="19"/>
               </w:rPr>
-              <w:t>4</w:t>
+              <w:t>2 (Estado actual: 2)</w:t>
             </w:r>
           </w:p>
         </w:tc>
@@ -996,9 +1022,9 @@
           <w:p>
             <w:r>
               <w:rPr>
-                <w:sz w:val="20"/>
+                <w:sz w:val="19"/>
               </w:rPr>
-              <w:t>Descuento de stock válido para un producto existente</w:t>
+              <w:t>Intento de cambiar al mismo estado actual en el que se encuentra.</w:t>
             </w:r>
           </w:p>
         </w:tc>
@@ -1009,117 +1035,9 @@
           <w:p>
             <w:r>
               <w:rPr>
-                <w:sz w:val="20"/>
+                <w:sz w:val="19"/>
               </w:rPr>
-              <w:t>Ejecución exitosa (UPDATE ejecutado)</w:t>
-            </w:r>
-          </w:p>
-        </w:tc>
-      </w:tr>
-      <w:tr>
-        <w:tc>
-          <w:tcPr>
-            <w:tcW w:type="dxa" w:w="2340"/>
-          </w:tcPr>
-          <w:p>
-            <w:r>
-              <w:rPr>
-                <w:sz w:val="20"/>
-              </w:rPr>
-              <w:t>null</w:t>
-            </w:r>
-          </w:p>
-        </w:tc>
-        <w:tc>
-          <w:tcPr>
-            <w:tcW w:type="dxa" w:w="2340"/>
-          </w:tcPr>
-          <w:p>
-            <w:r>
-              <w:rPr>
-                <w:sz w:val="20"/>
-              </w:rPr>
-              <w:t>4</w:t>
-            </w:r>
-          </w:p>
-        </w:tc>
-        <w:tc>
-          <w:tcPr>
-            <w:tcW w:type="dxa" w:w="2340"/>
-          </w:tcPr>
-          <w:p>
-            <w:r>
-              <w:rPr>
-                <w:sz w:val="20"/>
-              </w:rPr>
-              <w:t>Intento de descuento sin especificar producto</w:t>
-            </w:r>
-          </w:p>
-        </w:tc>
-        <w:tc>
-          <w:tcPr>
-            <w:tcW w:type="dxa" w:w="2340"/>
-          </w:tcPr>
-          <w:p>
-            <w:r>
-              <w:rPr>
-                <w:sz w:val="20"/>
-              </w:rPr>
-              <w:t>Error</w:t>
-            </w:r>
-          </w:p>
-        </w:tc>
-      </w:tr>
-      <w:tr>
-        <w:tc>
-          <w:tcPr>
-            <w:tcW w:type="dxa" w:w="2340"/>
-          </w:tcPr>
-          <w:p>
-            <w:r>
-              <w:rPr>
-                <w:sz w:val="20"/>
-              </w:rPr>
-              <w:t>3</w:t>
-            </w:r>
-          </w:p>
-        </w:tc>
-        <w:tc>
-          <w:tcPr>
-            <w:tcW w:type="dxa" w:w="2340"/>
-          </w:tcPr>
-          <w:p>
-            <w:r>
-              <w:rPr>
-                <w:sz w:val="20"/>
-              </w:rPr>
-              <w:t>-1</w:t>
-            </w:r>
-          </w:p>
-        </w:tc>
-        <w:tc>
-          <w:tcPr>
-            <w:tcW w:type="dxa" w:w="2340"/>
-          </w:tcPr>
-          <w:p>
-            <w:r>
-              <w:rPr>
-                <w:sz w:val="20"/>
-              </w:rPr>
-              <w:t>Intento de descontar cantidad negativa</w:t>
-            </w:r>
-          </w:p>
-        </w:tc>
-        <w:tc>
-          <w:tcPr>
-            <w:tcW w:type="dxa" w:w="2340"/>
-          </w:tcPr>
-          <w:p>
-            <w:r>
-              <w:rPr>
-                <w:sz w:val="20"/>
-              </w:rPr>
-              <w:t>Error</w:t>
+              <w:t>Error (Excepción: "El pedido ya se encuentra en ese estado")</w:t>
             </w:r>
           </w:p>
         </w:tc>

</xml_diff>